<commit_message>
The Tab1 to Tab 6 buttons were matched with the ICD
</commit_message>
<xml_diff>
--- a/Git_Setup_Guide.docx
+++ b/Git_Setup_Guide.docx
@@ -1639,22 +1639,10 @@
           </w:tcPr>
           <w:p>
             <w:r>
-              <w:rPr>
-                <w:rFonts w:ascii="Courier New" w:eastAsia="Courier New" w:hAnsi="Courier New" w:cs="Courier New"/>
-                <w:color w:val="CC0000"/>
-                <w:sz w:val="17"/>
-                <w:szCs w:val="17"/>
-              </w:rPr>
               <w:t xml:space="preserve">git </w:t>
             </w:r>
             <w:proofErr w:type="gramStart"/>
             <w:r>
-              <w:rPr>
-                <w:rFonts w:ascii="Courier New" w:eastAsia="Courier New" w:hAnsi="Courier New" w:cs="Courier New"/>
-                <w:color w:val="CC0000"/>
-                <w:sz w:val="17"/>
-                <w:szCs w:val="17"/>
-              </w:rPr>
               <w:t>add .</w:t>
             </w:r>
             <w:proofErr w:type="gramEnd"/>
@@ -2279,16 +2267,12 @@
         <w:rPr>
           <w:rFonts w:asciiTheme="majorBidi" w:hAnsiTheme="majorBidi" w:cstheme="majorBidi"/>
           <w:color w:val="EE0000"/>
-          <w:sz w:val="16"/>
-          <w:szCs w:val="16"/>
         </w:rPr>
       </w:pPr>
       <w:r>
         <w:rPr>
           <w:rFonts w:asciiTheme="majorBidi" w:hAnsiTheme="majorBidi" w:cstheme="majorBidi"/>
           <w:color w:val="EE0000"/>
-          <w:sz w:val="16"/>
-          <w:szCs w:val="16"/>
         </w:rPr>
         <w:t>Will this command fetch the whole project folder?</w:t>
       </w:r>
@@ -2813,16 +2797,16 @@
         <w:rPr>
           <w:rFonts w:asciiTheme="majorBidi" w:hAnsiTheme="majorBidi" w:cstheme="majorBidi"/>
           <w:color w:val="EE0000"/>
-          <w:sz w:val="16"/>
-          <w:szCs w:val="16"/>
+          <w:sz w:val="22"/>
+          <w:szCs w:val="22"/>
         </w:rPr>
       </w:pPr>
       <w:r>
         <w:rPr>
           <w:rFonts w:asciiTheme="majorBidi" w:hAnsiTheme="majorBidi" w:cstheme="majorBidi"/>
           <w:color w:val="EE0000"/>
-          <w:sz w:val="16"/>
-          <w:szCs w:val="16"/>
+          <w:sz w:val="22"/>
+          <w:szCs w:val="22"/>
         </w:rPr>
         <w:t xml:space="preserve">If </w:t>
       </w:r>
@@ -2831,8 +2815,8 @@
         <w:rPr>
           <w:rFonts w:asciiTheme="majorBidi" w:hAnsiTheme="majorBidi" w:cstheme="majorBidi"/>
           <w:color w:val="EE0000"/>
-          <w:sz w:val="16"/>
-          <w:szCs w:val="16"/>
+          <w:sz w:val="22"/>
+          <w:szCs w:val="22"/>
         </w:rPr>
         <w:t>i</w:t>
       </w:r>
@@ -2841,8 +2825,8 @@
         <w:rPr>
           <w:rFonts w:asciiTheme="majorBidi" w:hAnsiTheme="majorBidi" w:cstheme="majorBidi"/>
           <w:color w:val="EE0000"/>
-          <w:sz w:val="16"/>
-          <w:szCs w:val="16"/>
+          <w:sz w:val="22"/>
+          <w:szCs w:val="22"/>
         </w:rPr>
         <w:t xml:space="preserve"> want to pull one file then?</w:t>
       </w:r>

</xml_diff>